<commit_message>
Adding action cards 010 + 011.
</commit_message>
<xml_diff>
--- a/AO_early-alpha/card-files/AO_early-alpha_data/factionG_terms.docx
+++ b/AO_early-alpha/card-files/AO_early-alpha_data/factionG_terms.docx
@@ -10,6 +10,34 @@
           <w:szCs w:val="144"/>
         </w:rPr>
       </w:pPr>
+      <w:proofErr w:type="spellStart"/>
+      <w:r>
+        <w:rPr>
+          <w:rFonts w:ascii="Times New Roman" w:hAnsi="Times New Roman" w:cs="Times New Roman"/>
+          <w:sz w:val="144"/>
+          <w:szCs w:val="144"/>
+        </w:rPr>
+        <w:t>Huntre</w:t>
+      </w:r>
+      <w:proofErr w:type="spellEnd"/>
+      <w:r>
+        <w:rPr>
+          <w:rFonts w:ascii="Times New Roman" w:hAnsi="Times New Roman" w:cs="Times New Roman"/>
+          <w:sz w:val="144"/>
+          <w:szCs w:val="144"/>
+        </w:rPr>
+        <w:t>ꟊꟊ</w:t>
+      </w:r>
+    </w:p>
+    <w:p>
+      <w:pPr>
+        <w:rPr>
+          <w:rFonts w:ascii="Times New Roman" w:hAnsi="Times New Roman" w:cs="Times New Roman"/>
+          <w:sz w:val="144"/>
+          <w:szCs w:val="144"/>
+        </w:rPr>
+      </w:pPr>
+      <w:proofErr w:type="spellStart"/>
       <w:r>
         <w:rPr>
           <w:rFonts w:ascii="Times New Roman" w:hAnsi="Times New Roman" w:cs="Times New Roman"/>
@@ -18,6 +46,7 @@
         </w:rPr>
         <w:t>Longbowᴓman</w:t>
       </w:r>
+      <w:proofErr w:type="spellEnd"/>
     </w:p>
     <w:sectPr>
       <w:pgSz w:w="11906" w:h="16838" w:code="9"/>
@@ -633,7 +662,6 @@
   <w:style w:type="character" w:default="1" w:styleId="DefaultParagraphFont">
     <w:name w:val="Default Paragraph Font"/>
     <w:uiPriority w:val="1"/>
-    <w:semiHidden/>
     <w:unhideWhenUsed/>
   </w:style>
   <w:style w:type="table" w:default="1" w:styleId="TableNormal">

</xml_diff>